<commit_message>
RD2: gain and gain + you added to E and F (same setups, twins checked); prereg amendment; analysis covers all five framings
Co-Authored-By: Claude Opus 5.5 <noreply@anthropic.com>
Claude-Session: https://claude.ai/code/session_01MMCRR3CeBf6AnYqivqwtdY
</commit_message>
<xml_diff>
--- a/designs/rd2/PREREG_EF.docx
+++ b/designs/rd2/PREREG_EF.docx
@@ -486,6 +486,28 @@
         <w:t>Every version is reported, whatever it shows.</w:t>
       </w:r>
     </w:p>
+    <w:p>
+      <w:pPr>
+        <w:pStyle w:val="Heading1"/>
+      </w:pPr>
+      <w:r>
+        <w:t>Amendment (2026-10-19, evening, before any gain career of E or F had run)</w:t>
+      </w:r>
+    </w:p>
+    <w:p>
+      <w:r>
+        <w:t xml:space="preserve">The user: loss against gain is the point of the study, so </w:t>
+      </w:r>
+      <w:r>
+        <w:rPr>
+          <w:b/>
+        </w:rPr>
+        <w:t>gain and gain + you are added to E and F</w:t>
+      </w:r>
+      <w:r>
+        <w:t xml:space="preserve"> (10 careers each, paired with their B and D twins; checked with a scripted agent to be exactly the twin plus Bank C's six lines). The setup IDs are unchanged (the versions' memo and book code is the same hashed code). The first three versions' results had been seen when this was decided. Main tests: E1 and F1 stay as preregistered (the first three versions); added, as in B's H1, loss (loss and loss + you) against gain (gain and gain + you) within E and within F, and E2/F2 by framing over all five (Holm across five). The gain careers ran a day later than the others on the same pinned stack (H100s).</w:t>
+      </w:r>
+    </w:p>
     <w:sectPr>
       <w:pgSz w:w="12240" w:h="15840"/>
       <w:pgMar w:top="1440" w:right="1800" w:bottom="1440" w:left="1800" w:header="720" w:footer="720" w:gutter="0"/>

</xml_diff>

<commit_message>
RD2: correction: E and F's gain versions were planned (left out of the first launch by mistake), not exploratory
Co-Authored-By: Claude Opus 5.5 <noreply@anthropic.com>
Claude-Session: https://claude.ai/code/session_01MMCRR3CeBf6AnYqivqwtdY
</commit_message>
<xml_diff>
--- a/designs/rd2/PREREG_EF.docx
+++ b/designs/rd2/PREREG_EF.docx
@@ -491,21 +491,12 @@
         <w:pStyle w:val="Heading1"/>
       </w:pPr>
       <w:r>
-        <w:t>Amendment (2026-10-19, evening, before any gain career of E or F had run)</w:t>
+        <w:t>Correction (2026-10-19, night): gain and gain + you are planned versions, not an addition</w:t>
       </w:r>
     </w:p>
     <w:p>
       <w:r>
-        <w:t xml:space="preserve">The user: loss against gain is the point of the study, so </w:t>
-      </w:r>
-      <w:r>
-        <w:rPr>
-          <w:b/>
-        </w:rPr>
-        <w:t>gain and gain + you are added to E and F</w:t>
-      </w:r>
-      <w:r>
-        <w:t xml:space="preserve"> (10 careers each, paired with their B and D twins; checked with a scripted agent to be exactly the twin plus Bank C's six lines). The setup IDs are unchanged (the versions' memo and book code is the same hashed code). The first three versions' results had been seen when this was decided. Main tests: E1 and F1 stay as preregistered (the first three versions); added, as in B's H1, loss (loss and loss + you) against gain (gain and gain + you) within E and within F, and E2/F2 by framing over all five (Holm across five). The gain careers ran a day later than the others on the same pinned stack (H100s).</w:t>
+        <w:t>The gain and gain + you versions were part of E and F's design from the start: the user's frozen Bank C file has all five framings, written and frozen before any E or F career ran, and loss against gain is the study's core question. They were left out of the first launch on Claude's recommendation, to save compute; the user corrected this and they were run (10 careers each, paired with their B and D twins, checked with a scripted agent to be exactly the twin plus Bank C's six lines; setup IDs unchanged). They are analysed as planned versions, not as exploratory. For transparency: they ran a day after the first three versions, on the same pinned stack (H100s), after those versions' results had been seen. Tests: E1 and F1 as written above; E2/F2 by framing over all five (Holm across five); and, as in B's H1, loss (loss and loss + you) against gain (gain and gain + you) within E and within F.</w:t>
       </w:r>
     </w:p>
     <w:sectPr>

</xml_diff>